<commit_message>
Added extra error documentation
</commit_message>
<xml_diff>
--- a/Documentation/TODo liste. Gældende version. Ekstra information.docx
+++ b/Documentation/TODo liste. Gældende version. Ekstra information.docx
@@ -148,64 +148,44 @@
           <w:u w:val="none"/>
           <w:em w:val="none"/>
         </w:rPr>
-        <w:t xml:space="preserve">The feature for forcing JAWS to read the ”status line” in the bottom of the Main Menu by INSERT+PAGEDOWN does not </w:t>
-      </w:r>
-      <w:r>
-        <w:rPr>
-          <w:rFonts w:ascii="Arial" w:hAnsi="Arial"/>
-          <w:b w:val="false"/>
-          <w:i w:val="false"/>
-          <w:strike w:val="false"/>
-          <w:dstrike w:val="false"/>
-          <w:outline w:val="false"/>
-          <w:shadow w:val="false"/>
-          <w:color w:val="auto"/>
-          <w:sz w:val="20"/>
-          <w:u w:val="none"/>
-          <w:em w:val="none"/>
-        </w:rPr>
-        <w:t>a</w:t>
-      </w:r>
-      <w:r>
-        <w:rPr>
-          <w:rFonts w:ascii="Arial" w:hAnsi="Arial"/>
-          <w:b w:val="false"/>
-          <w:i w:val="false"/>
-          <w:strike w:val="false"/>
-          <w:dstrike w:val="false"/>
-          <w:outline w:val="false"/>
-          <w:shadow w:val="false"/>
-          <w:color w:val="auto"/>
-          <w:sz w:val="20"/>
-          <w:u w:val="none"/>
-          <w:em w:val="none"/>
-        </w:rPr>
-        <w:t xml:space="preserve">lways work anymore. </w:t>
-      </w:r>
-    </w:p>
-    <w:p>
-      <w:pPr>
-        <w:pStyle w:val="Normal"/>
-        <w:bidi w:val="0"/>
-        <w:jc w:val="left"/>
-        <w:rPr>
-          <w:rFonts w:ascii="Arial" w:hAnsi="Arial"/>
-          <w:b w:val="false"/>
-          <w:b w:val="false"/>
-          <w:i w:val="false"/>
-          <w:i w:val="false"/>
-          <w:strike w:val="false"/>
-          <w:dstrike w:val="false"/>
-          <w:outline w:val="false"/>
-          <w:shadow w:val="false"/>
-          <w:color w:val="auto"/>
-          <w:sz w:val="20"/>
-          <w:u w:val="none"/>
-          <w:em w:val="none"/>
-        </w:rPr>
-      </w:pPr>
-      <w:r>
-        <w:rPr/>
+        <w:t xml:space="preserve">The feature for forcing JAWS to read the ”status line” in the bottom of the Main Menu by INSERT+PAGEDOWN does not always work anymore. </w:t>
+      </w:r>
+    </w:p>
+    <w:p>
+      <w:pPr>
+        <w:pStyle w:val="Normal"/>
+        <w:bidi w:val="0"/>
+        <w:jc w:val="left"/>
+        <w:rPr>
+          <w:rFonts w:ascii="Arial" w:hAnsi="Arial"/>
+          <w:b w:val="false"/>
+          <w:b w:val="false"/>
+          <w:i w:val="false"/>
+          <w:i w:val="false"/>
+          <w:strike w:val="false"/>
+          <w:dstrike w:val="false"/>
+          <w:outline w:val="false"/>
+          <w:shadow w:val="false"/>
+          <w:color w:val="auto"/>
+          <w:sz w:val="20"/>
+          <w:u w:val="none"/>
+          <w:em w:val="none"/>
+        </w:rPr>
+      </w:pPr>
+      <w:r>
+        <w:rPr>
+          <w:rFonts w:ascii="Arial" w:hAnsi="Arial"/>
+          <w:b w:val="false"/>
+          <w:i w:val="false"/>
+          <w:strike w:val="false"/>
+          <w:dstrike w:val="false"/>
+          <w:outline w:val="false"/>
+          <w:shadow w:val="false"/>
+          <w:color w:val="auto"/>
+          <w:sz w:val="20"/>
+          <w:u w:val="none"/>
+          <w:em w:val="none"/>
+        </w:rPr>
       </w:r>
     </w:p>
     <w:p>
@@ -374,7 +354,19 @@
         </w:rPr>
       </w:pPr>
       <w:r>
-        <w:rPr/>
+        <w:rPr>
+          <w:rFonts w:ascii="Arial" w:hAnsi="Arial"/>
+          <w:b w:val="false"/>
+          <w:i w:val="false"/>
+          <w:strike w:val="false"/>
+          <w:dstrike w:val="false"/>
+          <w:outline w:val="false"/>
+          <w:shadow w:val="false"/>
+          <w:color w:val="auto"/>
+          <w:sz w:val="20"/>
+          <w:u w:val="none"/>
+          <w:em w:val="none"/>
+        </w:rPr>
       </w:r>
     </w:p>
     <w:p>
@@ -447,7 +439,19 @@
         </w:rPr>
       </w:pPr>
       <w:r>
-        <w:rPr/>
+        <w:rPr>
+          <w:rFonts w:ascii="Arial" w:hAnsi="Arial"/>
+          <w:b w:val="false"/>
+          <w:i w:val="false"/>
+          <w:strike w:val="false"/>
+          <w:dstrike w:val="false"/>
+          <w:outline w:val="false"/>
+          <w:shadow w:val="false"/>
+          <w:color w:val="auto"/>
+          <w:sz w:val="20"/>
+          <w:u w:val="none"/>
+          <w:em w:val="none"/>
+        </w:rPr>
       </w:r>
     </w:p>
     <w:p>
@@ -520,7 +524,19 @@
         </w:rPr>
       </w:pPr>
       <w:r>
-        <w:rPr/>
+        <w:rPr>
+          <w:rFonts w:ascii="Arial" w:hAnsi="Arial"/>
+          <w:b w:val="false"/>
+          <w:i w:val="false"/>
+          <w:strike w:val="false"/>
+          <w:dstrike w:val="false"/>
+          <w:outline w:val="false"/>
+          <w:shadow w:val="false"/>
+          <w:color w:val="auto"/>
+          <w:sz w:val="20"/>
+          <w:u w:val="none"/>
+          <w:em w:val="none"/>
+        </w:rPr>
       </w:r>
     </w:p>
     <w:p>
@@ -569,7 +585,19 @@
         </w:rPr>
       </w:pPr>
       <w:r>
-        <w:rPr/>
+        <w:rPr>
+          <w:rFonts w:ascii="Arial" w:hAnsi="Arial"/>
+          <w:b w:val="false"/>
+          <w:i w:val="false"/>
+          <w:strike w:val="false"/>
+          <w:dstrike w:val="false"/>
+          <w:outline w:val="false"/>
+          <w:shadow w:val="false"/>
+          <w:color w:val="auto"/>
+          <w:sz w:val="20"/>
+          <w:u w:val="none"/>
+          <w:em w:val="none"/>
+        </w:rPr>
       </w:r>
     </w:p>
     <w:p>
@@ -650,6 +678,549 @@
         <w:br/>
         <w:br/>
         <w:t xml:space="preserve">Ingenerel it could be an idea to prevent Form resizing ?  </w:t>
+      </w:r>
+    </w:p>
+    <w:p>
+      <w:pPr>
+        <w:pStyle w:val="Normal"/>
+        <w:bidi w:val="0"/>
+        <w:jc w:val="left"/>
+        <w:rPr/>
+      </w:pPr>
+      <w:r>
+        <w:rPr/>
+      </w:r>
+      <w:r>
+        <w:br w:type="page"/>
+      </w:r>
+    </w:p>
+    <w:p>
+      <w:pPr>
+        <w:pStyle w:val="Normal"/>
+        <w:bidi w:val="0"/>
+        <w:jc w:val="left"/>
+        <w:rPr>
+          <w:b/>
+          <w:b/>
+          <w:bCs/>
+        </w:rPr>
+      </w:pPr>
+      <w:r>
+        <w:rPr>
+          <w:b/>
+          <w:bCs/>
+        </w:rPr>
+        <w:t>2024, May</w:t>
+      </w:r>
+    </w:p>
+    <w:p>
+      <w:pPr>
+        <w:pStyle w:val="Normal"/>
+        <w:bidi w:val="0"/>
+        <w:jc w:val="left"/>
+        <w:rPr/>
+      </w:pPr>
+      <w:r>
+        <w:rPr/>
+      </w:r>
+    </w:p>
+    <w:p>
+      <w:pPr>
+        <w:pStyle w:val="Normal"/>
+        <w:bidi w:val="0"/>
+        <w:jc w:val="left"/>
+        <w:rPr/>
+      </w:pPr>
+      <w:r>
+        <w:rPr/>
+        <w:t>To further investigate the problem a simple program was written.</w:t>
+      </w:r>
+    </w:p>
+    <w:p>
+      <w:pPr>
+        <w:pStyle w:val="Normal"/>
+        <w:bidi w:val="0"/>
+        <w:jc w:val="left"/>
+        <w:rPr/>
+      </w:pPr>
+      <w:r>
+        <w:rPr/>
+      </w:r>
+    </w:p>
+    <w:p>
+      <w:pPr>
+        <w:pStyle w:val="Normal"/>
+        <w:bidi w:val="0"/>
+        <w:jc w:val="left"/>
+        <w:rPr/>
+      </w:pPr>
+      <w:r>
+        <w:rPr/>
+        <w:t>This project file is found at</w:t>
+      </w:r>
+    </w:p>
+    <w:p>
+      <w:pPr>
+        <w:pStyle w:val="Normal"/>
+        <w:bidi w:val="0"/>
+        <w:jc w:val="left"/>
+        <w:rPr/>
+      </w:pPr>
+      <w:r>
+        <w:rPr/>
+      </w:r>
+    </w:p>
+    <w:p>
+      <w:pPr>
+        <w:pStyle w:val="Normal"/>
+        <w:bidi w:val="0"/>
+        <w:jc w:val="left"/>
+        <w:rPr/>
+      </w:pPr>
+      <w:r>
+        <w:rPr/>
+        <w:t>C:\Users\holme\Dropbox\Root\Visual Studio 2015\Projects\VariousExperiments\JawsSayBottomLineExperiment\JawsSayBottomLineExperiment.csproj</w:t>
+      </w:r>
+    </w:p>
+    <w:p>
+      <w:pPr>
+        <w:pStyle w:val="Normal"/>
+        <w:bidi w:val="0"/>
+        <w:jc w:val="left"/>
+        <w:rPr/>
+      </w:pPr>
+      <w:r>
+        <w:rPr/>
+      </w:r>
+    </w:p>
+    <w:p>
+      <w:pPr>
+        <w:pStyle w:val="Normal"/>
+        <w:bidi w:val="0"/>
+        <w:jc w:val="left"/>
+        <w:rPr/>
+      </w:pPr>
+      <w:r>
+        <w:rPr/>
+        <w:t>This program demonstrates the error in a very simple form, only containing:</w:t>
+      </w:r>
+    </w:p>
+    <w:p>
+      <w:pPr>
+        <w:pStyle w:val="Normal"/>
+        <w:numPr>
+          <w:ilvl w:val="0"/>
+          <w:numId w:val="1"/>
+        </w:numPr>
+        <w:bidi w:val="0"/>
+        <w:jc w:val="left"/>
+        <w:rPr/>
+      </w:pPr>
+      <w:r>
+        <w:rPr/>
+        <w:t>At top: A Listbox, containing a large amount of garbage text</w:t>
+      </w:r>
+    </w:p>
+    <w:p>
+      <w:pPr>
+        <w:pStyle w:val="Normal"/>
+        <w:numPr>
+          <w:ilvl w:val="0"/>
+          <w:numId w:val="1"/>
+        </w:numPr>
+        <w:bidi w:val="0"/>
+        <w:jc w:val="left"/>
+        <w:rPr/>
+      </w:pPr>
+      <w:r>
+        <w:rPr/>
+        <w:t>A bottom: A Label containing a short text ”This text is the bottom line of window”</w:t>
+      </w:r>
+    </w:p>
+    <w:p>
+      <w:pPr>
+        <w:pStyle w:val="Normal"/>
+        <w:bidi w:val="0"/>
+        <w:jc w:val="left"/>
+        <w:rPr/>
+      </w:pPr>
+      <w:r>
+        <w:rPr/>
+      </w:r>
+    </w:p>
+    <w:p>
+      <w:pPr>
+        <w:pStyle w:val="Normal"/>
+        <w:bidi w:val="0"/>
+        <w:jc w:val="left"/>
+        <w:rPr/>
+      </w:pPr>
+      <w:r>
+        <w:rPr/>
+        <w:t xml:space="preserve">The amount of garbage text can be controlled by </w:t>
+      </w:r>
+    </w:p>
+    <w:p>
+      <w:pPr>
+        <w:pStyle w:val="Normal"/>
+        <w:numPr>
+          <w:ilvl w:val="0"/>
+          <w:numId w:val="2"/>
+        </w:numPr>
+        <w:bidi w:val="0"/>
+        <w:jc w:val="left"/>
+        <w:rPr/>
+      </w:pPr>
+      <w:r>
+        <w:rPr/>
+        <w:t>SHIFT + UP/DOWN (for amount of characters in each line)</w:t>
+      </w:r>
+    </w:p>
+    <w:p>
+      <w:pPr>
+        <w:pStyle w:val="Normal"/>
+        <w:numPr>
+          <w:ilvl w:val="0"/>
+          <w:numId w:val="2"/>
+        </w:numPr>
+        <w:bidi w:val="0"/>
+        <w:jc w:val="left"/>
+        <w:rPr/>
+      </w:pPr>
+      <w:r>
+        <w:rPr/>
+        <w:t>SHIFT + RIGHT/LEFT (for the number of lines).</w:t>
+      </w:r>
+    </w:p>
+    <w:p>
+      <w:pPr>
+        <w:pStyle w:val="Normal"/>
+        <w:bidi w:val="0"/>
+        <w:jc w:val="left"/>
+        <w:rPr/>
+      </w:pPr>
+      <w:r>
+        <w:rPr/>
+      </w:r>
+    </w:p>
+    <w:p>
+      <w:pPr>
+        <w:pStyle w:val="Normal"/>
+        <w:bidi w:val="0"/>
+        <w:jc w:val="left"/>
+        <w:rPr/>
+      </w:pPr>
+      <w:r>
+        <w:rPr/>
+        <w:t>The error occurs when the size of the garbage text exceeds a limit and disappears when the size of garbage text is reduced again.</w:t>
+      </w:r>
+    </w:p>
+    <w:p>
+      <w:pPr>
+        <w:pStyle w:val="Normal"/>
+        <w:bidi w:val="0"/>
+        <w:jc w:val="left"/>
+        <w:rPr/>
+      </w:pPr>
+      <w:r>
+        <w:rPr/>
+      </w:r>
+    </w:p>
+    <w:p>
+      <w:pPr>
+        <w:pStyle w:val="Normal"/>
+        <w:bidi w:val="0"/>
+        <w:jc w:val="left"/>
+        <w:rPr/>
+      </w:pPr>
+      <w:r>
+        <w:rPr/>
+        <w:t>Even that does not seem to worry Michael at Instrulog.</w:t>
+      </w:r>
+    </w:p>
+    <w:p>
+      <w:pPr>
+        <w:pStyle w:val="Normal"/>
+        <w:bidi w:val="0"/>
+        <w:jc w:val="left"/>
+        <w:rPr/>
+      </w:pPr>
+      <w:r>
+        <w:rPr/>
+        <w:t>He suggests that we can have a script file included in some further JAWS release, but that solution does not seem very attractive. Instead we investigate if it is possible to distribute the script file with our own product and install it as a user (and application) – specific script. With or without the users knowledge,</w:t>
+      </w:r>
+    </w:p>
+    <w:p>
+      <w:pPr>
+        <w:pStyle w:val="Normal"/>
+        <w:bidi w:val="0"/>
+        <w:jc w:val="left"/>
+        <w:rPr/>
+      </w:pPr>
+      <w:r>
+        <w:rPr/>
+      </w:r>
+    </w:p>
+    <w:p>
+      <w:pPr>
+        <w:pStyle w:val="Normal"/>
+        <w:bidi w:val="0"/>
+        <w:jc w:val="left"/>
+        <w:rPr/>
+      </w:pPr>
+      <w:r>
+        <w:rPr/>
+        <w:t xml:space="preserve">The installation path seems to be  </w:t>
+      </w:r>
+    </w:p>
+    <w:p>
+      <w:pPr>
+        <w:pStyle w:val="Normal"/>
+        <w:bidi w:val="0"/>
+        <w:jc w:val="left"/>
+        <w:rPr/>
+      </w:pPr>
+      <w:r>
+        <w:rPr/>
+      </w:r>
+    </w:p>
+    <w:p>
+      <w:pPr>
+        <w:pStyle w:val="Normal"/>
+        <w:bidi w:val="0"/>
+        <w:jc w:val="left"/>
+        <w:rPr/>
+      </w:pPr>
+      <w:r>
+        <w:rPr/>
+        <w:t>C:\Users\holme\AppData\Roaming\Freedom Scientific\JAWS\2024\Settings\dan</w:t>
+      </w:r>
+    </w:p>
+    <w:p>
+      <w:pPr>
+        <w:pStyle w:val="Normal"/>
+        <w:bidi w:val="0"/>
+        <w:jc w:val="left"/>
+        <w:rPr/>
+      </w:pPr>
+      <w:r>
+        <w:rPr/>
+      </w:r>
+    </w:p>
+    <w:p>
+      <w:pPr>
+        <w:pStyle w:val="Normal"/>
+        <w:bidi w:val="0"/>
+        <w:jc w:val="left"/>
+        <w:rPr/>
+      </w:pPr>
+      <w:r>
+        <w:rPr/>
+        <w:t>which can be resolved to</w:t>
+      </w:r>
+    </w:p>
+    <w:p>
+      <w:pPr>
+        <w:pStyle w:val="Normal"/>
+        <w:bidi w:val="0"/>
+        <w:jc w:val="left"/>
+        <w:rPr/>
+      </w:pPr>
+      <w:r>
+        <w:rPr/>
+      </w:r>
+    </w:p>
+    <w:p>
+      <w:pPr>
+        <w:pStyle w:val="Normal"/>
+        <w:bidi w:val="0"/>
+        <w:jc w:val="left"/>
+        <w:rPr/>
+      </w:pPr>
+      <w:r>
+        <w:rPr/>
+        <w:t>%AppData%\Roaming\Freedom Scientific\JAWS\%JawsVersion%\Settings\%Language%</w:t>
+      </w:r>
+    </w:p>
+    <w:p>
+      <w:pPr>
+        <w:pStyle w:val="Normal"/>
+        <w:bidi w:val="0"/>
+        <w:jc w:val="left"/>
+        <w:rPr/>
+      </w:pPr>
+      <w:r>
+        <w:rPr/>
+      </w:r>
+    </w:p>
+    <w:p>
+      <w:pPr>
+        <w:pStyle w:val="Normal"/>
+        <w:bidi w:val="0"/>
+        <w:jc w:val="left"/>
+        <w:rPr/>
+      </w:pPr>
+      <w:r>
+        <w:rPr/>
+        <w:t xml:space="preserve">with </w:t>
+      </w:r>
+    </w:p>
+    <w:p>
+      <w:pPr>
+        <w:pStyle w:val="Normal"/>
+        <w:bidi w:val="0"/>
+        <w:jc w:val="left"/>
+        <w:rPr/>
+      </w:pPr>
+      <w:r>
+        <w:rPr/>
+      </w:r>
+    </w:p>
+    <w:p>
+      <w:pPr>
+        <w:pStyle w:val="Normal"/>
+        <w:bidi w:val="0"/>
+        <w:jc w:val="left"/>
+        <w:rPr/>
+      </w:pPr>
+      <w:r>
+        <w:rPr/>
+        <w:t xml:space="preserve">%AppData% = </w:t>
+        <w:tab/>
+        <w:t>”C:\Users\holme\AppData”</w:t>
+      </w:r>
+    </w:p>
+    <w:p>
+      <w:pPr>
+        <w:pStyle w:val="Normal"/>
+        <w:bidi w:val="0"/>
+        <w:jc w:val="left"/>
+        <w:rPr/>
+      </w:pPr>
+      <w:r>
+        <w:rPr/>
+        <w:t xml:space="preserve">%JawsVersion% = </w:t>
+        <w:tab/>
+        <w:t>”2024”</w:t>
+      </w:r>
+    </w:p>
+    <w:p>
+      <w:pPr>
+        <w:pStyle w:val="Normal"/>
+        <w:bidi w:val="0"/>
+        <w:jc w:val="left"/>
+        <w:rPr/>
+      </w:pPr>
+      <w:r>
+        <w:rPr/>
+        <w:t xml:space="preserve">%Langusge% = </w:t>
+        <w:tab/>
+        <w:t>”dan”</w:t>
+      </w:r>
+    </w:p>
+    <w:p>
+      <w:pPr>
+        <w:pStyle w:val="Normal"/>
+        <w:bidi w:val="0"/>
+        <w:jc w:val="left"/>
+        <w:rPr/>
+      </w:pPr>
+      <w:r>
+        <w:rPr/>
+      </w:r>
+    </w:p>
+    <w:p>
+      <w:pPr>
+        <w:pStyle w:val="Normal"/>
+        <w:bidi w:val="0"/>
+        <w:jc w:val="left"/>
+        <w:rPr/>
+      </w:pPr>
+      <w:r>
+        <w:rPr/>
+        <w:t>- at least for the time being.</w:t>
+      </w:r>
+    </w:p>
+    <w:p>
+      <w:pPr>
+        <w:pStyle w:val="Normal"/>
+        <w:bidi w:val="0"/>
+        <w:jc w:val="left"/>
+        <w:rPr/>
+      </w:pPr>
+      <w:r>
+        <w:rPr/>
+      </w:r>
+    </w:p>
+    <w:p>
+      <w:pPr>
+        <w:pStyle w:val="Normal"/>
+        <w:bidi w:val="0"/>
+        <w:jc w:val="left"/>
+        <w:rPr/>
+      </w:pPr>
+      <w:r>
+        <w:rPr/>
+        <w:t>We (at least) need to be sure if this syntax will also be used in future JAWS versions!</w:t>
+      </w:r>
+    </w:p>
+    <w:p>
+      <w:pPr>
+        <w:pStyle w:val="Normal"/>
+        <w:bidi w:val="0"/>
+        <w:jc w:val="left"/>
+        <w:rPr/>
+      </w:pPr>
+      <w:r>
+        <w:rPr/>
+      </w:r>
+    </w:p>
+    <w:p>
+      <w:pPr>
+        <w:pStyle w:val="Normal"/>
+        <w:bidi w:val="0"/>
+        <w:jc w:val="left"/>
+        <w:rPr/>
+      </w:pPr>
+      <w:r>
+        <w:rPr/>
+      </w:r>
+    </w:p>
+    <w:p>
+      <w:pPr>
+        <w:pStyle w:val="Normal"/>
+        <w:bidi w:val="0"/>
+        <w:jc w:val="left"/>
+        <w:rPr/>
+      </w:pPr>
+      <w:r>
+        <w:rPr/>
+      </w:r>
+      <w:r>
+        <w:br w:type="page"/>
+      </w:r>
+    </w:p>
+    <w:p>
+      <w:pPr>
+        <w:pStyle w:val="Normal"/>
+        <w:bidi w:val="0"/>
+        <w:jc w:val="left"/>
+        <w:rPr/>
+      </w:pPr>
+      <w:r>
+        <w:rPr/>
+      </w:r>
+    </w:p>
+    <w:p>
+      <w:pPr>
+        <w:pStyle w:val="Normal"/>
+        <w:bidi w:val="0"/>
+        <w:jc w:val="left"/>
+        <w:rPr/>
+      </w:pPr>
+      <w:r>
+        <w:rPr/>
+        <w:t>How do other programs handle this?</w:t>
       </w:r>
     </w:p>
     <w:p>
@@ -674,6 +1245,395 @@
     </w:sectPr>
   </w:body>
 </w:document>
+</file>
+
+<file path=word/numbering.xml><?xml version="1.0" encoding="utf-8"?>
+<w:numbering xmlns:w="http://schemas.openxmlformats.org/wordprocessingml/2006/main" xmlns:o="urn:schemas-microsoft-com:office:office" xmlns:r="http://schemas.openxmlformats.org/officeDocument/2006/relationships" xmlns:v="urn:schemas-microsoft-com:vml" xmlns:mc="http://schemas.openxmlformats.org/markup-compatibility/2006" xmlns:w14="http://schemas.microsoft.com/office/word/2010/wordml" mc:Ignorable="w14">
+  <w:abstractNum w:abstractNumId="1">
+    <w:lvl w:ilvl="0">
+      <w:start w:val="1"/>
+      <w:numFmt w:val="decimal"/>
+      <w:lvlText w:val="%1."/>
+      <w:lvlJc w:val="left"/>
+      <w:pPr>
+        <w:tabs>
+          <w:tab w:val="num" w:pos="720"/>
+        </w:tabs>
+        <w:ind w:left="720" w:hanging="360"/>
+      </w:pPr>
+      <w:rPr/>
+    </w:lvl>
+    <w:lvl w:ilvl="1">
+      <w:start w:val="1"/>
+      <w:numFmt w:val="decimal"/>
+      <w:lvlText w:val="%2."/>
+      <w:lvlJc w:val="left"/>
+      <w:pPr>
+        <w:tabs>
+          <w:tab w:val="num" w:pos="1080"/>
+        </w:tabs>
+        <w:ind w:left="1080" w:hanging="360"/>
+      </w:pPr>
+      <w:rPr/>
+    </w:lvl>
+    <w:lvl w:ilvl="2">
+      <w:start w:val="1"/>
+      <w:numFmt w:val="decimal"/>
+      <w:lvlText w:val="%3."/>
+      <w:lvlJc w:val="left"/>
+      <w:pPr>
+        <w:tabs>
+          <w:tab w:val="num" w:pos="1440"/>
+        </w:tabs>
+        <w:ind w:left="1440" w:hanging="360"/>
+      </w:pPr>
+      <w:rPr/>
+    </w:lvl>
+    <w:lvl w:ilvl="3">
+      <w:start w:val="1"/>
+      <w:numFmt w:val="decimal"/>
+      <w:lvlText w:val="%4."/>
+      <w:lvlJc w:val="left"/>
+      <w:pPr>
+        <w:tabs>
+          <w:tab w:val="num" w:pos="1800"/>
+        </w:tabs>
+        <w:ind w:left="1800" w:hanging="360"/>
+      </w:pPr>
+      <w:rPr/>
+    </w:lvl>
+    <w:lvl w:ilvl="4">
+      <w:start w:val="1"/>
+      <w:numFmt w:val="decimal"/>
+      <w:lvlText w:val="%5."/>
+      <w:lvlJc w:val="left"/>
+      <w:pPr>
+        <w:tabs>
+          <w:tab w:val="num" w:pos="2160"/>
+        </w:tabs>
+        <w:ind w:left="2160" w:hanging="360"/>
+      </w:pPr>
+      <w:rPr/>
+    </w:lvl>
+    <w:lvl w:ilvl="5">
+      <w:start w:val="1"/>
+      <w:numFmt w:val="decimal"/>
+      <w:lvlText w:val="%6."/>
+      <w:lvlJc w:val="left"/>
+      <w:pPr>
+        <w:tabs>
+          <w:tab w:val="num" w:pos="2520"/>
+        </w:tabs>
+        <w:ind w:left="2520" w:hanging="360"/>
+      </w:pPr>
+      <w:rPr/>
+    </w:lvl>
+    <w:lvl w:ilvl="6">
+      <w:start w:val="1"/>
+      <w:numFmt w:val="decimal"/>
+      <w:lvlText w:val="%7."/>
+      <w:lvlJc w:val="left"/>
+      <w:pPr>
+        <w:tabs>
+          <w:tab w:val="num" w:pos="2880"/>
+        </w:tabs>
+        <w:ind w:left="2880" w:hanging="360"/>
+      </w:pPr>
+      <w:rPr/>
+    </w:lvl>
+    <w:lvl w:ilvl="7">
+      <w:start w:val="1"/>
+      <w:numFmt w:val="decimal"/>
+      <w:lvlText w:val="%8."/>
+      <w:lvlJc w:val="left"/>
+      <w:pPr>
+        <w:tabs>
+          <w:tab w:val="num" w:pos="3240"/>
+        </w:tabs>
+        <w:ind w:left="3240" w:hanging="360"/>
+      </w:pPr>
+      <w:rPr/>
+    </w:lvl>
+    <w:lvl w:ilvl="8">
+      <w:start w:val="1"/>
+      <w:numFmt w:val="decimal"/>
+      <w:lvlText w:val="%9."/>
+      <w:lvlJc w:val="left"/>
+      <w:pPr>
+        <w:tabs>
+          <w:tab w:val="num" w:pos="3600"/>
+        </w:tabs>
+        <w:ind w:left="3600" w:hanging="360"/>
+      </w:pPr>
+      <w:rPr/>
+    </w:lvl>
+  </w:abstractNum>
+  <w:abstractNum w:abstractNumId="2">
+    <w:lvl w:ilvl="0">
+      <w:start w:val="1"/>
+      <w:numFmt w:val="bullet"/>
+      <w:lvlText w:val=""/>
+      <w:lvlJc w:val="left"/>
+      <w:pPr>
+        <w:tabs>
+          <w:tab w:val="num" w:pos="720"/>
+        </w:tabs>
+        <w:ind w:left="720" w:hanging="360"/>
+      </w:pPr>
+      <w:rPr>
+        <w:rFonts w:ascii="Symbol" w:hAnsi="Symbol" w:cs="Symbol" w:hint="default"/>
+      </w:rPr>
+    </w:lvl>
+    <w:lvl w:ilvl="1">
+      <w:start w:val="1"/>
+      <w:numFmt w:val="bullet"/>
+      <w:lvlText w:val="◦"/>
+      <w:lvlJc w:val="left"/>
+      <w:pPr>
+        <w:tabs>
+          <w:tab w:val="num" w:pos="1080"/>
+        </w:tabs>
+        <w:ind w:left="1080" w:hanging="360"/>
+      </w:pPr>
+      <w:rPr>
+        <w:rFonts w:ascii="OpenSymbol" w:hAnsi="OpenSymbol" w:cs="OpenSymbol" w:hint="default"/>
+      </w:rPr>
+    </w:lvl>
+    <w:lvl w:ilvl="2">
+      <w:start w:val="1"/>
+      <w:numFmt w:val="bullet"/>
+      <w:lvlText w:val="▪"/>
+      <w:lvlJc w:val="left"/>
+      <w:pPr>
+        <w:tabs>
+          <w:tab w:val="num" w:pos="1440"/>
+        </w:tabs>
+        <w:ind w:left="1440" w:hanging="360"/>
+      </w:pPr>
+      <w:rPr>
+        <w:rFonts w:ascii="OpenSymbol" w:hAnsi="OpenSymbol" w:cs="OpenSymbol" w:hint="default"/>
+      </w:rPr>
+    </w:lvl>
+    <w:lvl w:ilvl="3">
+      <w:start w:val="1"/>
+      <w:numFmt w:val="bullet"/>
+      <w:lvlText w:val=""/>
+      <w:lvlJc w:val="left"/>
+      <w:pPr>
+        <w:tabs>
+          <w:tab w:val="num" w:pos="1800"/>
+        </w:tabs>
+        <w:ind w:left="1800" w:hanging="360"/>
+      </w:pPr>
+      <w:rPr>
+        <w:rFonts w:ascii="Symbol" w:hAnsi="Symbol" w:cs="Symbol" w:hint="default"/>
+      </w:rPr>
+    </w:lvl>
+    <w:lvl w:ilvl="4">
+      <w:start w:val="1"/>
+      <w:numFmt w:val="bullet"/>
+      <w:lvlText w:val="◦"/>
+      <w:lvlJc w:val="left"/>
+      <w:pPr>
+        <w:tabs>
+          <w:tab w:val="num" w:pos="2160"/>
+        </w:tabs>
+        <w:ind w:left="2160" w:hanging="360"/>
+      </w:pPr>
+      <w:rPr>
+        <w:rFonts w:ascii="OpenSymbol" w:hAnsi="OpenSymbol" w:cs="OpenSymbol" w:hint="default"/>
+      </w:rPr>
+    </w:lvl>
+    <w:lvl w:ilvl="5">
+      <w:start w:val="1"/>
+      <w:numFmt w:val="bullet"/>
+      <w:lvlText w:val="▪"/>
+      <w:lvlJc w:val="left"/>
+      <w:pPr>
+        <w:tabs>
+          <w:tab w:val="num" w:pos="2520"/>
+        </w:tabs>
+        <w:ind w:left="2520" w:hanging="360"/>
+      </w:pPr>
+      <w:rPr>
+        <w:rFonts w:ascii="OpenSymbol" w:hAnsi="OpenSymbol" w:cs="OpenSymbol" w:hint="default"/>
+      </w:rPr>
+    </w:lvl>
+    <w:lvl w:ilvl="6">
+      <w:start w:val="1"/>
+      <w:numFmt w:val="bullet"/>
+      <w:lvlText w:val=""/>
+      <w:lvlJc w:val="left"/>
+      <w:pPr>
+        <w:tabs>
+          <w:tab w:val="num" w:pos="2880"/>
+        </w:tabs>
+        <w:ind w:left="2880" w:hanging="360"/>
+      </w:pPr>
+      <w:rPr>
+        <w:rFonts w:ascii="Symbol" w:hAnsi="Symbol" w:cs="Symbol" w:hint="default"/>
+      </w:rPr>
+    </w:lvl>
+    <w:lvl w:ilvl="7">
+      <w:start w:val="1"/>
+      <w:numFmt w:val="bullet"/>
+      <w:lvlText w:val="◦"/>
+      <w:lvlJc w:val="left"/>
+      <w:pPr>
+        <w:tabs>
+          <w:tab w:val="num" w:pos="3240"/>
+        </w:tabs>
+        <w:ind w:left="3240" w:hanging="360"/>
+      </w:pPr>
+      <w:rPr>
+        <w:rFonts w:ascii="OpenSymbol" w:hAnsi="OpenSymbol" w:cs="OpenSymbol" w:hint="default"/>
+      </w:rPr>
+    </w:lvl>
+    <w:lvl w:ilvl="8">
+      <w:start w:val="1"/>
+      <w:numFmt w:val="bullet"/>
+      <w:lvlText w:val="▪"/>
+      <w:lvlJc w:val="left"/>
+      <w:pPr>
+        <w:tabs>
+          <w:tab w:val="num" w:pos="3600"/>
+        </w:tabs>
+        <w:ind w:left="3600" w:hanging="360"/>
+      </w:pPr>
+      <w:rPr>
+        <w:rFonts w:ascii="OpenSymbol" w:hAnsi="OpenSymbol" w:cs="OpenSymbol" w:hint="default"/>
+      </w:rPr>
+    </w:lvl>
+  </w:abstractNum>
+  <w:abstractNum w:abstractNumId="3">
+    <w:lvl w:ilvl="0">
+      <w:start w:val="1"/>
+      <w:numFmt w:val="none"/>
+      <w:suff w:val="nothing"/>
+      <w:lvlText w:val=""/>
+      <w:lvlJc w:val="left"/>
+      <w:pPr>
+        <w:tabs>
+          <w:tab w:val="num" w:pos="0"/>
+        </w:tabs>
+        <w:ind w:left="0" w:hanging="0"/>
+      </w:pPr>
+    </w:lvl>
+    <w:lvl w:ilvl="1">
+      <w:start w:val="1"/>
+      <w:numFmt w:val="none"/>
+      <w:suff w:val="nothing"/>
+      <w:lvlText w:val=""/>
+      <w:lvlJc w:val="left"/>
+      <w:pPr>
+        <w:tabs>
+          <w:tab w:val="num" w:pos="0"/>
+        </w:tabs>
+        <w:ind w:left="0" w:hanging="0"/>
+      </w:pPr>
+    </w:lvl>
+    <w:lvl w:ilvl="2">
+      <w:start w:val="1"/>
+      <w:numFmt w:val="none"/>
+      <w:suff w:val="nothing"/>
+      <w:lvlText w:val=""/>
+      <w:lvlJc w:val="left"/>
+      <w:pPr>
+        <w:tabs>
+          <w:tab w:val="num" w:pos="0"/>
+        </w:tabs>
+        <w:ind w:left="0" w:hanging="0"/>
+      </w:pPr>
+    </w:lvl>
+    <w:lvl w:ilvl="3">
+      <w:start w:val="1"/>
+      <w:numFmt w:val="none"/>
+      <w:suff w:val="nothing"/>
+      <w:lvlText w:val=""/>
+      <w:lvlJc w:val="left"/>
+      <w:pPr>
+        <w:tabs>
+          <w:tab w:val="num" w:pos="0"/>
+        </w:tabs>
+        <w:ind w:left="0" w:hanging="0"/>
+      </w:pPr>
+    </w:lvl>
+    <w:lvl w:ilvl="4">
+      <w:start w:val="1"/>
+      <w:numFmt w:val="none"/>
+      <w:suff w:val="nothing"/>
+      <w:lvlText w:val=""/>
+      <w:lvlJc w:val="left"/>
+      <w:pPr>
+        <w:tabs>
+          <w:tab w:val="num" w:pos="0"/>
+        </w:tabs>
+        <w:ind w:left="0" w:hanging="0"/>
+      </w:pPr>
+    </w:lvl>
+    <w:lvl w:ilvl="5">
+      <w:start w:val="1"/>
+      <w:numFmt w:val="none"/>
+      <w:suff w:val="nothing"/>
+      <w:lvlText w:val=""/>
+      <w:lvlJc w:val="left"/>
+      <w:pPr>
+        <w:tabs>
+          <w:tab w:val="num" w:pos="0"/>
+        </w:tabs>
+        <w:ind w:left="0" w:hanging="0"/>
+      </w:pPr>
+    </w:lvl>
+    <w:lvl w:ilvl="6">
+      <w:start w:val="1"/>
+      <w:numFmt w:val="none"/>
+      <w:suff w:val="nothing"/>
+      <w:lvlText w:val=""/>
+      <w:lvlJc w:val="left"/>
+      <w:pPr>
+        <w:tabs>
+          <w:tab w:val="num" w:pos="0"/>
+        </w:tabs>
+        <w:ind w:left="0" w:hanging="0"/>
+      </w:pPr>
+    </w:lvl>
+    <w:lvl w:ilvl="7">
+      <w:start w:val="1"/>
+      <w:numFmt w:val="none"/>
+      <w:suff w:val="nothing"/>
+      <w:lvlText w:val=""/>
+      <w:lvlJc w:val="left"/>
+      <w:pPr>
+        <w:tabs>
+          <w:tab w:val="num" w:pos="0"/>
+        </w:tabs>
+        <w:ind w:left="0" w:hanging="0"/>
+      </w:pPr>
+    </w:lvl>
+    <w:lvl w:ilvl="8">
+      <w:start w:val="1"/>
+      <w:numFmt w:val="none"/>
+      <w:suff w:val="nothing"/>
+      <w:lvlText w:val=""/>
+      <w:lvlJc w:val="left"/>
+      <w:pPr>
+        <w:tabs>
+          <w:tab w:val="num" w:pos="0"/>
+        </w:tabs>
+        <w:ind w:left="0" w:hanging="0"/>
+      </w:pPr>
+    </w:lvl>
+  </w:abstractNum>
+  <w:num w:numId="1">
+    <w:abstractNumId w:val="1"/>
+  </w:num>
+  <w:num w:numId="2">
+    <w:abstractNumId w:val="2"/>
+  </w:num>
+  <w:num w:numId="3">
+    <w:abstractNumId w:val="3"/>
+  </w:num>
+</w:numbering>
 </file>
 
 <file path=word/styles.xml><?xml version="1.0" encoding="utf-8"?>
@@ -711,6 +1671,18 @@
       <w:sz w:val="24"/>
       <w:szCs w:val="24"/>
       <w:lang w:val="da-DK" w:eastAsia="zh-CN" w:bidi="hi-IN"/>
+    </w:rPr>
+  </w:style>
+  <w:style w:type="character" w:styleId="Nummereringstegn">
+    <w:name w:val="Nummereringstegn"/>
+    <w:qFormat/>
+    <w:rPr/>
+  </w:style>
+  <w:style w:type="character" w:styleId="Punktopstilling">
+    <w:name w:val="Punktopstilling"/>
+    <w:qFormat/>
+    <w:rPr>
+      <w:rFonts w:ascii="OpenSymbol" w:hAnsi="OpenSymbol" w:eastAsia="OpenSymbol" w:cs="OpenSymbol"/>
     </w:rPr>
   </w:style>
   <w:style w:type="paragraph" w:styleId="Overskrift">

</xml_diff>